<commit_message>
Shade paperback code blocks; honour per-edition rights and publisher
Both reference DOCX files now define the Source Code paragraph style: light
grey fill (#EFEFEF), thin border, and a 9 pt code font so ~77 characters fit
per line at 7.5x9.25 instead of wrapping at ~65.

make-metadata.py reads rights, publisher and keywords from the edition entry
before falling back to the book level, so a translated edition no longer
inherits the primary language's copyright line and publisher.

Co-Authored-By: Claude Opus 5.5 <noreply@anthropic.com>
</commit_message>
<xml_diff>
--- a/tools/lib/paperback-7.5x9.25.docx
+++ b/tools/lib/paperback-7.5x9.25.docx
@@ -1099,7 +1099,7 @@
     <w:basedOn w:val="BodyTextChar"/>
     <w:rPr>
       <w:rFonts w:ascii="Consolas" w:hAnsi="Consolas"/>
-      <w:sz w:val="22"/>
+      <w:sz w:val="18"/>
     </w:rPr>
   </w:style>
   <w:style w:type="character" w:customStyle="1" w:styleId="SectionNumber">
@@ -1137,6 +1137,24 @@
       <w:bCs w:val="0"/>
       <w:color w:val="365F91" w:themeColor="accent1" w:themeShade="BF"/>
     </w:rPr>
+  </w:style>
+  <w:style w:type="paragraph" w:customStyle="1" w:styleId="SourceCode">
+    <w:name w:val="Source Code"/>
+    <w:basedOn w:val="Normal"/>
+    <w:link w:val="VerbatimChar"/>
+    <w:qFormat/>
+    <w:pPr>
+      <w:wordWrap w:val="off"/>
+      <w:pBdr>
+        <w:top w:val="single" w:sz="4" w:space="4" w:color="BFBFBF"/>
+        <w:left w:val="single" w:sz="4" w:space="4" w:color="BFBFBF"/>
+        <w:bottom w:val="single" w:sz="4" w:space="4" w:color="BFBFBF"/>
+        <w:right w:val="single" w:sz="4" w:space="4" w:color="BFBFBF"/>
+      </w:pBdr>
+      <w:shd w:val="clear" w:color="auto" w:fill="EFEFEF"/>
+      <w:spacing w:before="160" w:after="160" w:line="240" w:lineRule="auto"/>
+      <w:ind w:left="113" w:right="113"/>
+    </w:pPr>
   </w:style>
 </w:styles>
 </file>

</xml_diff>